<commit_message>
Validate form versions (currently v1.3)
Exit add_new_species script with message about outdated form versions
if the form version is not v1.3.
</commit_message>
<xml_diff>
--- a/scripts/add_new_species/tests/fixtures/submission_form_example/01-test-species-submission_v1.3.docx
+++ b/scripts/add_new_species/tests/fixtures/submission_form_example/01-test-species-submission_v1.3.docx
@@ -32,7 +32,7 @@
           <w:szCs w:val="36"/>
           <w:lang w:val="en-US"/>
         </w:rPr>
-        <w:t>Species</w:t>
+        <w:t>Species submission for</w:t>
       </w:r>
       <w:r>
         <w:rPr>
@@ -44,55 +44,7 @@
           <w:szCs w:val="36"/>
           <w:lang w:val="en-US"/>
         </w:rPr>
-        <w:t xml:space="preserve"> </w:t>
-      </w:r>
-      <w:r>
-        <w:rPr>
-          <w:rFonts w:ascii="Lato" w:hAnsi="Lato"/>
-          <w:b/>
-          <w:bCs/>
-          <w:color w:val="065B64"/>
-          <w:sz w:val="36"/>
-          <w:szCs w:val="36"/>
-          <w:lang w:val="en-US"/>
-        </w:rPr>
-        <w:t>s</w:t>
-      </w:r>
-      <w:r>
-        <w:rPr>
-          <w:rFonts w:ascii="Lato" w:hAnsi="Lato"/>
-          <w:b/>
-          <w:bCs/>
-          <w:color w:val="065B64"/>
-          <w:sz w:val="36"/>
-          <w:szCs w:val="36"/>
-          <w:lang w:val="en-US"/>
-        </w:rPr>
-        <w:t xml:space="preserve">ubmission </w:t>
-      </w:r>
-      <w:r>
-        <w:rPr>
-          <w:rFonts w:ascii="Lato" w:hAnsi="Lato"/>
-          <w:b/>
-          <w:bCs/>
-          <w:color w:val="065B64"/>
-          <w:sz w:val="36"/>
-          <w:szCs w:val="36"/>
-          <w:lang w:val="en-US"/>
-        </w:rPr>
-        <w:t>f</w:t>
-      </w:r>
-      <w:r>
-        <w:rPr>
-          <w:rFonts w:ascii="Lato" w:hAnsi="Lato"/>
-          <w:b/>
-          <w:bCs/>
-          <w:color w:val="065B64"/>
-          <w:sz w:val="36"/>
-          <w:szCs w:val="36"/>
-          <w:lang w:val="en-US"/>
-        </w:rPr>
-        <w:t>orm</w:t>
+        <w:t>m</w:t>
       </w:r>
     </w:p>
     <w:p>
@@ -123,112 +75,54 @@
           <w:szCs w:val="28"/>
           <w:lang w:val="en-US"/>
         </w:rPr>
-        <w:t>S</w:t>
-      </w:r>
-      <w:r>
-        <w:rPr>
-          <w:rFonts w:ascii="Lato" w:hAnsi="Lato"/>
-          <w:color w:val="065B64"/>
-          <w:sz w:val="28"/>
-          <w:szCs w:val="28"/>
-          <w:lang w:val="en-US"/>
-        </w:rPr>
-        <w:t xml:space="preserve">wedish </w:t>
-      </w:r>
-      <w:r>
-        <w:rPr>
-          <w:rFonts w:ascii="Lato" w:hAnsi="Lato"/>
-          <w:color w:val="065B64"/>
-          <w:sz w:val="28"/>
-          <w:szCs w:val="28"/>
-          <w:lang w:val="en-US"/>
-        </w:rPr>
-        <w:t>R</w:t>
-      </w:r>
-      <w:r>
-        <w:rPr>
-          <w:rFonts w:ascii="Lato" w:hAnsi="Lato"/>
-          <w:color w:val="065B64"/>
-          <w:sz w:val="28"/>
-          <w:szCs w:val="28"/>
-          <w:lang w:val="en-US"/>
-        </w:rPr>
-        <w:t xml:space="preserve">eference </w:t>
-      </w:r>
-      <w:r>
-        <w:rPr>
-          <w:rFonts w:ascii="Lato" w:hAnsi="Lato"/>
-          <w:color w:val="065B64"/>
-          <w:sz w:val="28"/>
-          <w:szCs w:val="28"/>
-          <w:lang w:val="en-US"/>
-        </w:rPr>
-        <w:t>G</w:t>
-      </w:r>
-      <w:r>
-        <w:rPr>
-          <w:rFonts w:ascii="Lato" w:hAnsi="Lato"/>
-          <w:color w:val="065B64"/>
-          <w:sz w:val="28"/>
-          <w:szCs w:val="28"/>
-          <w:lang w:val="en-US"/>
-        </w:rPr>
-        <w:t xml:space="preserve">enome </w:t>
-      </w:r>
-      <w:r>
-        <w:rPr>
-          <w:rFonts w:ascii="Lato" w:hAnsi="Lato"/>
-          <w:color w:val="065B64"/>
-          <w:sz w:val="28"/>
-          <w:szCs w:val="28"/>
-          <w:lang w:val="en-US"/>
-        </w:rPr>
-        <w:t>P</w:t>
-      </w:r>
-      <w:r>
-        <w:rPr>
-          <w:rFonts w:ascii="Lato" w:hAnsi="Lato"/>
-          <w:color w:val="065B64"/>
-          <w:sz w:val="28"/>
-          <w:szCs w:val="28"/>
-          <w:lang w:val="en-US"/>
-        </w:rPr>
-        <w:t>ortal</w:t>
+        <w:t>Swedish Reference Genome Portal</w:t>
       </w:r>
     </w:p>
     <w:p>
       <w:pPr>
         <w:spacing w:after="0"/>
+        <w:jc w:val="center"/>
         <w:rPr>
           <w:rFonts w:ascii="Lato" w:hAnsi="Lato"/>
           <w:sz w:val="22"/>
           <w:szCs w:val="22"/>
         </w:rPr>
       </w:pPr>
+      <w:r>
+        <w:rPr>
+          <w:rFonts w:ascii="Lato" w:hAnsi="Lato"/>
+          <w:sz w:val="22"/>
+          <w:szCs w:val="22"/>
+        </w:rPr>
+        <w:t>Form version 1.3</w:t>
+      </w:r>
     </w:p>
     <w:p>
       <w:pPr>
+        <w:spacing w:after="0"/>
+        <w:jc w:val="center"/>
         <w:rPr>
           <w:rFonts w:ascii="Lato" w:hAnsi="Lato"/>
           <w:sz w:val="22"/>
           <w:szCs w:val="22"/>
         </w:rPr>
       </w:pPr>
-      <w:r>
+    </w:p>
+    <w:p>
+      <w:pPr>
         <w:rPr>
           <w:rFonts w:ascii="Lato" w:hAnsi="Lato"/>
           <w:sz w:val="22"/>
           <w:szCs w:val="22"/>
         </w:rPr>
-        <w:t xml:space="preserve">Hej, we are glad you want to display your data in the portal! </w:t>
-      </w:r>
+      </w:pPr>
       <w:r>
         <w:rPr>
           <w:rFonts w:ascii="Lato" w:hAnsi="Lato"/>
           <w:sz w:val="22"/>
           <w:szCs w:val="22"/>
         </w:rPr>
-        <w:t xml:space="preserve">Before </w:t>
+        <w:t xml:space="preserve">Hej, we are glad you want to display your data in the portal! </w:t>
       </w:r>
       <w:r>
         <w:rPr>
@@ -236,7 +130,7 @@
           <w:sz w:val="22"/>
           <w:szCs w:val="22"/>
         </w:rPr>
-        <w:t>you continue</w:t>
+        <w:t xml:space="preserve">Before </w:t>
       </w:r>
       <w:r>
         <w:rPr>
@@ -244,7 +138,7 @@
           <w:sz w:val="22"/>
           <w:szCs w:val="22"/>
         </w:rPr>
-        <w:t>,</w:t>
+        <w:t>you continue</w:t>
       </w:r>
       <w:r>
         <w:rPr>
@@ -252,7 +146,7 @@
           <w:sz w:val="22"/>
           <w:szCs w:val="22"/>
         </w:rPr>
-        <w:t xml:space="preserve"> please make sure your </w:t>
+        <w:t>,</w:t>
       </w:r>
       <w:r>
         <w:rPr>
@@ -260,7 +154,7 @@
           <w:sz w:val="22"/>
           <w:szCs w:val="22"/>
         </w:rPr>
-        <w:t>data</w:t>
+        <w:t xml:space="preserve"> please make sure your </w:t>
       </w:r>
       <w:r>
         <w:rPr>
@@ -268,7 +162,7 @@
           <w:sz w:val="22"/>
           <w:szCs w:val="22"/>
         </w:rPr>
-        <w:t xml:space="preserve"> meets </w:t>
+        <w:t>data</w:t>
       </w:r>
       <w:r>
         <w:rPr>
@@ -276,37 +170,55 @@
           <w:sz w:val="22"/>
           <w:szCs w:val="22"/>
         </w:rPr>
+        <w:t xml:space="preserve"> meets </w:t>
+      </w:r>
+      <w:r>
+        <w:rPr>
+          <w:rFonts w:ascii="Lato" w:hAnsi="Lato"/>
+          <w:sz w:val="22"/>
+          <w:szCs w:val="22"/>
+        </w:rPr>
         <w:t xml:space="preserve">the </w:t>
       </w:r>
-      <w:hyperlink r:id="rId8" w:history="1">
-        <w:r>
-          <w:rPr>
-            <w:rStyle w:val="Hyperlink"/>
-            <w:rFonts w:ascii="Lato" w:hAnsi="Lato"/>
-            <w:sz w:val="22"/>
-            <w:szCs w:val="22"/>
-          </w:rPr>
-          <w:t>service scope</w:t>
-        </w:r>
-        <w:r>
-          <w:rPr>
-            <w:rStyle w:val="Hyperlink"/>
-            <w:rFonts w:ascii="Lato" w:hAnsi="Lato"/>
-            <w:sz w:val="22"/>
-            <w:szCs w:val="22"/>
-          </w:rPr>
-          <w:t>,</w:t>
-        </w:r>
-        <w:r>
-          <w:rPr>
-            <w:rStyle w:val="Hyperlink"/>
-            <w:rFonts w:ascii="Lato" w:hAnsi="Lato"/>
-            <w:sz w:val="22"/>
-            <w:szCs w:val="22"/>
-          </w:rPr>
-          <w:t xml:space="preserve"> requirements</w:t>
-        </w:r>
-      </w:hyperlink>
+      <w:r>
+        <w:fldChar w:fldCharType="begin"/>
+      </w:r>
+      <w:r>
+        <w:instrText>HYPERLINK "https://genomes.scilifelab.se/contribute/"</w:instrText>
+      </w:r>
+      <w:r>
+        <w:fldChar w:fldCharType="separate"/>
+      </w:r>
+      <w:r>
+        <w:rPr>
+          <w:rStyle w:val="Hyperlink"/>
+          <w:rFonts w:ascii="Lato" w:hAnsi="Lato"/>
+          <w:sz w:val="22"/>
+          <w:szCs w:val="22"/>
+        </w:rPr>
+        <w:t>service scope</w:t>
+      </w:r>
+      <w:r>
+        <w:rPr>
+          <w:rStyle w:val="Hyperlink"/>
+          <w:rFonts w:ascii="Lato" w:hAnsi="Lato"/>
+          <w:sz w:val="22"/>
+          <w:szCs w:val="22"/>
+        </w:rPr>
+        <w:t>,</w:t>
+      </w:r>
+      <w:r>
+        <w:rPr>
+          <w:rStyle w:val="Hyperlink"/>
+          <w:rFonts w:ascii="Lato" w:hAnsi="Lato"/>
+          <w:sz w:val="22"/>
+          <w:szCs w:val="22"/>
+        </w:rPr>
+        <w:t xml:space="preserve"> requirements</w:t>
+      </w:r>
+      <w:r>
+        <w:fldChar w:fldCharType="end"/>
+      </w:r>
       <w:r>
         <w:rPr>
           <w:rFonts w:ascii="Lato" w:hAnsi="Lato"/>
@@ -324,17 +236,27 @@
         </w:rPr>
         <w:t xml:space="preserve"> and </w:t>
       </w:r>
-      <w:hyperlink r:id="rId9" w:history="1">
-        <w:r>
-          <w:rPr>
-            <w:rStyle w:val="Hyperlink"/>
-            <w:rFonts w:ascii="Lato" w:hAnsi="Lato"/>
-            <w:sz w:val="22"/>
-            <w:szCs w:val="22"/>
-          </w:rPr>
-          <w:t>terms of use</w:t>
-        </w:r>
-      </w:hyperlink>
+      <w:r>
+        <w:fldChar w:fldCharType="begin"/>
+      </w:r>
+      <w:r>
+        <w:instrText>HYPERLINK "https://genomes.scilifelab.se/terms/"</w:instrText>
+      </w:r>
+      <w:r>
+        <w:fldChar w:fldCharType="separate"/>
+      </w:r>
+      <w:r>
+        <w:rPr>
+          <w:rStyle w:val="Hyperlink"/>
+          <w:rFonts w:ascii="Lato" w:hAnsi="Lato"/>
+          <w:sz w:val="22"/>
+          <w:szCs w:val="22"/>
+        </w:rPr>
+        <w:t>terms of use</w:t>
+      </w:r>
+      <w:r>
+        <w:fldChar w:fldCharType="end"/>
+      </w:r>
       <w:r>
         <w:rPr>
           <w:rFonts w:ascii="Lato" w:hAnsi="Lato"/>
@@ -1270,16 +1192,7 @@
                     <w:szCs w:val="22"/>
                     <w:lang w:val="en-US"/>
                   </w:rPr>
-                  <w:t xml:space="preserve"> </w:t>
-                </w:r>
-                <w:r>
-                  <w:rPr>
-                    <w:rFonts w:ascii="Lato" w:hAnsi="Lato" w:cs="Arial"/>
-                    <w:sz w:val="22"/>
-                    <w:szCs w:val="22"/>
-                    <w:lang w:val="en-US"/>
-                  </w:rPr>
-                  <w:t xml:space="preserve">Volvox </w:t>
+                  <w:t xml:space="preserve"> Volvox </w:t>
                 </w:r>
                 <w:proofErr w:type="spellStart"/>
                 <w:r>
@@ -1374,16 +1287,7 @@
                     <w:szCs w:val="22"/>
                     <w:lang w:val="en-US"/>
                   </w:rPr>
-                  <w:t xml:space="preserve"> </w:t>
-                </w:r>
-                <w:r>
-                  <w:rPr>
-                    <w:rFonts w:ascii="Lato" w:hAnsi="Lato" w:cs="Arial"/>
-                    <w:sz w:val="22"/>
-                    <w:szCs w:val="22"/>
-                    <w:lang w:val="en-US"/>
-                  </w:rPr>
-                  <w:t>A species of colonial green algae, and a test description that runs for multiple lines in the table</w:t>
+                  <w:t xml:space="preserve"> A species of colonial green algae, and a test description that runs for multiple lines in the table</w:t>
                 </w:r>
                 <w:r>
                   <w:rPr>
@@ -1465,23 +1369,7 @@
                     <w:color w:val="212121"/>
                     <w:shd w:val="clear" w:color="auto" w:fill="FFFFFF"/>
                   </w:rPr>
-                  <w:t xml:space="preserve"> </w:t>
-                </w:r>
-                <w:r>
-                  <w:rPr>
-                    <w:rFonts w:ascii="Roboto" w:hAnsi="Roboto"/>
-                    <w:color w:val="212121"/>
-                    <w:shd w:val="clear" w:color="auto" w:fill="FFFFFF"/>
-                  </w:rPr>
-                  <w:t>f. nagariensis</w:t>
-                </w:r>
-                <w:r>
-                  <w:rPr>
-                    <w:rFonts w:ascii="Roboto" w:hAnsi="Roboto"/>
-                    <w:color w:val="212121"/>
-                    <w:shd w:val="clear" w:color="auto" w:fill="FFFFFF"/>
-                  </w:rPr>
-                  <w:t xml:space="preserve"> </w:t>
+                  <w:t xml:space="preserve"> f. nagariensis </w:t>
                 </w:r>
                 <w:r>
                   <w:rPr>
@@ -1649,7 +1537,7 @@
               </w:rPr>
               <w:t xml:space="preserve">in </w:t>
             </w:r>
-            <w:hyperlink r:id="rId10" w:history="1">
+            <w:hyperlink r:id="rId8" w:history="1">
               <w:r>
                 <w:rPr>
                   <w:rStyle w:val="Hyperlink"/>
@@ -1912,7 +1800,7 @@
               </w:rPr>
               <w:t xml:space="preserve"> </w:t>
             </w:r>
-            <w:hyperlink r:id="rId11" w:history="1">
+            <w:hyperlink r:id="rId9" w:history="1">
               <w:r>
                 <w:rPr>
                   <w:rStyle w:val="Hyperlink"/>
@@ -2368,7 +2256,7 @@
               </w:rPr>
               <w:t xml:space="preserve">. Format all reference in </w:t>
             </w:r>
-            <w:hyperlink r:id="rId12" w:history="1">
+            <w:hyperlink r:id="rId10" w:history="1">
               <w:r>
                 <w:rPr>
                   <w:rStyle w:val="Hyperlink"/>
@@ -2433,15 +2321,7 @@
                     <w:color w:val="222222"/>
                     <w:shd w:val="clear" w:color="auto" w:fill="FFFFFF"/>
                   </w:rPr>
-                  <w:t xml:space="preserve"> </w:t>
-                </w:r>
-                <w:r>
-                  <w:rPr>
-                    <w:rFonts w:ascii="Arial" w:hAnsi="Arial" w:cs="Arial"/>
-                    <w:color w:val="222222"/>
-                    <w:shd w:val="clear" w:color="auto" w:fill="FFFFFF"/>
-                  </w:rPr>
-                  <w:t xml:space="preserve">ReftestGenome1, T. (2025). Test of ref parsing1. Journal. DOI. </w:t>
+                  <w:t xml:space="preserve"> ReftestGenome1, T. (2025). Test of ref parsing1. Journal. DOI. </w:t>
                 </w:r>
               </w:p>
             </w:sdtContent>
@@ -3156,16 +3036,7 @@
                     <w:sz w:val="22"/>
                     <w:szCs w:val="22"/>
                   </w:rPr>
-                  <w:t xml:space="preserve"> </w:t>
-                </w:r>
-                <w:r>
-                  <w:rPr>
-                    <w:rFonts w:ascii="Lato" w:eastAsia="Lato" w:hAnsi="Lato" w:cs="Lato"/>
-                    <w:color w:val="666666"/>
-                    <w:sz w:val="22"/>
-                    <w:szCs w:val="22"/>
-                  </w:rPr>
-                  <w:t xml:space="preserve">Lorem ipsum by Jane Doe, used with permission </w:t>
+                  <w:t xml:space="preserve"> Lorem ipsum by Jane Doe, used with permission </w:t>
                 </w:r>
               </w:p>
             </w:tc>
@@ -3241,43 +3112,7 @@
                     <w:sz w:val="22"/>
                     <w:szCs w:val="22"/>
                   </w:rPr>
-                  <w:t xml:space="preserve"> </w:t>
-                </w:r>
-                <w:r>
-                  <w:rPr>
-                    <w:rFonts w:ascii="Lato" w:eastAsia="Lato" w:hAnsi="Lato" w:cs="Lato"/>
-                    <w:color w:val="666666"/>
-                    <w:sz w:val="22"/>
-                    <w:szCs w:val="22"/>
-                  </w:rPr>
-                  <w:t xml:space="preserve"> </w:t>
-                </w:r>
-                <w:r>
-                  <w:rPr>
-                    <w:rFonts w:ascii="Lato" w:eastAsia="Lato" w:hAnsi="Lato" w:cs="Lato"/>
-                    <w:color w:val="666666"/>
-                    <w:sz w:val="22"/>
-                    <w:szCs w:val="22"/>
-                  </w:rPr>
-                  <w:t>www.example.com/image.webp</w:t>
-                </w:r>
-                <w:r>
-                  <w:rPr>
-                    <w:rFonts w:ascii="Lato" w:eastAsia="Lato" w:hAnsi="Lato" w:cs="Lato"/>
-                    <w:color w:val="666666"/>
-                    <w:sz w:val="22"/>
-                    <w:szCs w:val="22"/>
-                  </w:rPr>
-                  <w:t xml:space="preserve"> </w:t>
-                </w:r>
-                <w:r>
-                  <w:rPr>
-                    <w:rFonts w:ascii="Lato" w:eastAsia="Lato" w:hAnsi="Lato" w:cs="Lato"/>
-                    <w:color w:val="666666"/>
-                    <w:sz w:val="22"/>
-                    <w:szCs w:val="22"/>
-                  </w:rPr>
-                  <w:t xml:space="preserve"> </w:t>
+                  <w:t xml:space="preserve">  www.example.com/image.webp  </w:t>
                 </w:r>
               </w:p>
             </w:tc>
@@ -4006,7 +3841,7 @@
         </w:rPr>
         <w:t xml:space="preserve">: </w:t>
       </w:r>
-      <w:hyperlink r:id="rId13" w:history="1">
+      <w:hyperlink r:id="rId11" w:history="1">
         <w:r>
           <w:rPr>
             <w:rStyle w:val="Hyperlink"/>
@@ -4025,9 +3860,9 @@
       </w:r>
     </w:p>
     <w:sectPr>
-      <w:headerReference w:type="default" r:id="rId14"/>
-      <w:footerReference w:type="even" r:id="rId15"/>
-      <w:footerReference w:type="default" r:id="rId16"/>
+      <w:headerReference w:type="default" r:id="rId12"/>
+      <w:footerReference w:type="even" r:id="rId13"/>
+      <w:footerReference w:type="default" r:id="rId14"/>
       <w:pgSz w:w="11906" w:h="16838"/>
       <w:pgMar w:top="1440" w:right="1440" w:bottom="1440" w:left="1440" w:header="708" w:footer="708" w:gutter="0"/>
       <w:pgNumType w:start="1"/>
@@ -4287,10 +4122,7 @@
       <w:t xml:space="preserve"> </w:t>
     </w:r>
     <w:r>
-      <w:t xml:space="preserve">     version 1.</w:t>
-    </w:r>
-    <w:r>
-      <w:t>3</w:t>
+      <w:t xml:space="preserve">     </w:t>
     </w:r>
   </w:p>
   <w:p>
@@ -7881,6 +7713,7 @@
     <w:rsid w:val="000A4541"/>
     <w:rsid w:val="000B6BC9"/>
     <w:rsid w:val="000C6886"/>
+    <w:rsid w:val="00115AF2"/>
     <w:rsid w:val="00163945"/>
     <w:rsid w:val="00166E36"/>
     <w:rsid w:val="0017295C"/>
@@ -7920,6 +7753,7 @@
     <w:rsid w:val="00785DDF"/>
     <w:rsid w:val="00794D27"/>
     <w:rsid w:val="008E395A"/>
+    <w:rsid w:val="00905F09"/>
     <w:rsid w:val="0094564E"/>
     <w:rsid w:val="00965CCF"/>
     <w:rsid w:val="00970E0E"/>
@@ -7950,6 +7784,7 @@
     <w:rsid w:val="00D97D6F"/>
     <w:rsid w:val="00DC587F"/>
     <w:rsid w:val="00EB577F"/>
+    <w:rsid w:val="00FE3CBD"/>
     <w:rsid w:val="00FF3794"/>
   </w:rsids>
   <m:mathPr>

</xml_diff>